<commit_message>
adding environment setup / org and struct to report
</commit_message>
<xml_diff>
--- a/Documents/Phase3ReportTemp.docx
+++ b/Documents/Phase3ReportTemp.docx
@@ -6,9 +6,21 @@
       <w:pPr>
         <w:pStyle w:val="Title"/>
         <w:jc w:val="center"/>
+        <w:rPr>
+          <w:u w:val="single"/>
+        </w:rPr>
       </w:pPr>
       <w:r>
-        <w:t>Assignment 3 Test Report</w:t>
+        <w:rPr>
+          <w:u w:val="single"/>
+        </w:rPr>
+        <w:t>Phase-</w:t>
+      </w:r>
+      <w:r>
+        <w:rPr>
+          <w:u w:val="single"/>
+        </w:rPr>
+        <w:t>3 Test Report</w:t>
       </w:r>
     </w:p>
     <w:p/>
@@ -88,14 +100,82 @@
         <w:t>.</w:t>
       </w:r>
     </w:p>
-    <w:p/>
-    <w:p/>
     <w:p>
       <w:pPr>
         <w:pStyle w:val="Heading1"/>
       </w:pPr>
       <w:r>
-        <w:t xml:space="preserve">Test Quality and Coverage </w:t>
+        <w:t>Test Environment Setu</w:t>
+      </w:r>
+      <w:r>
+        <w:t>p</w:t>
+      </w:r>
+    </w:p>
+    <w:p>
+      <w:pPr>
+        <w:rPr>
+          <w:rFonts w:asciiTheme="majorHAnsi" w:eastAsiaTheme="majorEastAsia" w:hAnsiTheme="majorHAnsi" w:cstheme="majorBidi"/>
+          <w:color w:val="0F4761" w:themeColor="accent1" w:themeShade="BF"/>
+          <w:sz w:val="40"/>
+          <w:szCs w:val="40"/>
+        </w:rPr>
+      </w:pPr>
+      <w:r>
+        <w:t>All</w:t>
+      </w:r>
+      <w:r>
+        <w:t xml:space="preserve"> our testing was performed in a local development environment using Java 21 and Apache Maven</w:t>
+      </w:r>
+      <w:r>
+        <w:t>. We followed the standard Maven directory structure, placing our production code in the src/main/java directory and our test code in the src/test/java directory. All required libraries, including JUnit and JaCoCo, were managed through the project’s pom.xml file, which meant that anyone cloning the repository could run the tests without needing to manually install any additional dependencies. We executed all of our tests through the terminal on our local machine, which also helped us easily verify that the build process was working as expected.</w:t>
+      </w:r>
+      <w:r>
+        <w:br/>
+      </w:r>
+      <w:r>
+        <w:br/>
+      </w:r>
+      <w:r>
+        <w:rPr>
+          <w:rStyle w:val="Heading1Char"/>
+        </w:rPr>
+        <w:t>Test Organization and Structure</w:t>
+      </w:r>
+      <w:r>
+        <w:br/>
+      </w:r>
+      <w:r>
+        <w:t xml:space="preserve">We organized our test code to match the structure of the main application, which made it easier for us to find and understand our test files. We used separate folders for the entities and engine packages, and we named each test file after the class it was testing for example, </w:t>
+      </w:r>
+      <w:proofErr w:type="spellStart"/>
+      <w:r>
+        <w:t>PlayerTest</w:t>
+      </w:r>
+      <w:proofErr w:type="spellEnd"/>
+      <w:r>
+        <w:t xml:space="preserve"> for the Player class. This made our code more organized and easier to manage as we added more tests. Keeping related tests together also helped make it clear what each test file was meant to check</w:t>
+      </w:r>
+      <w:r>
+        <w:t>.</w:t>
+      </w:r>
+    </w:p>
+    <w:p>
+      <w:pPr>
+        <w:pStyle w:val="Heading1"/>
+      </w:pPr>
+    </w:p>
+    <w:p>
+      <w:pPr>
+        <w:pStyle w:val="Heading1"/>
+      </w:pPr>
+      <w:r>
+        <w:t>Test Quality and Coverage</w:t>
+      </w:r>
+      <w:r>
+        <w:t xml:space="preserve"> </w:t>
+      </w:r>
+      <w:r>
+        <w:t xml:space="preserve"> </w:t>
       </w:r>
     </w:p>
     <w:p>
@@ -224,7 +304,15 @@
         <w:t xml:space="preserve"> </w:t>
       </w:r>
       <w:r>
-        <w:t xml:space="preserve">This was due to the fact that the </w:t>
+        <w:t xml:space="preserve">This was </w:t>
+      </w:r>
+      <w:proofErr w:type="gramStart"/>
+      <w:r>
+        <w:t>due to the fact that</w:t>
+      </w:r>
+      <w:proofErr w:type="gramEnd"/>
+      <w:r>
+        <w:t xml:space="preserve"> the </w:t>
       </w:r>
       <w:r>
         <w:t xml:space="preserve">file reader </w:t>
@@ -243,6 +331,18 @@
       </w:r>
       <w:r>
         <w:t>nto the reader and concatenated with the file name, thus a string was always present.</w:t>
+      </w:r>
+      <w:r>
+        <w:br/>
+      </w:r>
+      <w:r>
+        <w:br/>
+      </w:r>
+      <w:r>
+        <w:br/>
+      </w:r>
+      <w:r>
+        <w:br/>
       </w:r>
     </w:p>
     <w:sectPr>

</xml_diff>